<commit_message>
fix: format lab report with page 1 details only, aim on page 2, and 2-column source code layout
</commit_message>
<xml_diff>
--- a/24CS810_T_Sadasivarao_241FA04985_UniCard_Studio.docx
+++ b/24CS810_T_Sadasivarao_241FA04985_UniCard_Studio.docx
@@ -286,6 +286,24 @@
         <w:jc w:val="both"/>
         <w:rPr>
           <w:rFonts w:ascii="Times New Roman" w:hAnsi="Times New Roman" w:cs="Times New Roman"/>
+          <w:sz w:val="32"/>
+          <w:szCs w:val="32"/>
+        </w:rPr>
+      </w:pPr>
+      <w:r>
+        <w:rPr>
+          <w:rFonts w:ascii="Times New Roman" w:hAnsi="Times New Roman" w:cs="Times New Roman"/>
+          <w:sz w:val="32"/>
+          <w:szCs w:val="32"/>
+        </w:rPr>
+        <w:br w:type="page"/>
+      </w:r>
+    </w:p>
+    <w:p>
+      <w:pPr>
+        <w:jc w:val="both"/>
+        <w:rPr>
+          <w:rFonts w:ascii="Times New Roman" w:hAnsi="Times New Roman" w:cs="Times New Roman"/>
           <w:b/>
           <w:bCs/>
           <w:color w:val="000000" w:themeColor="text1"/>
@@ -876,6 +894,22 @@
         </w:rPr>
         <w:t xml:space="preserve">    └── App.jsx</w:t>
       </w:r>
+    </w:p>
+    <w:p>
+      <w:pPr>
+        <w:jc w:val="both"/>
+        <w:rPr>
+          <w:rFonts w:ascii="Times New Roman" w:hAnsi="Times New Roman" w:cs="Times New Roman"/>
+          <w:sz w:val="32"/>
+          <w:szCs w:val="32"/>
+        </w:rPr>
+        <w:sectPr>
+          <w:pgSz w:w="11906" w:h="16838"/>
+          <w:pgMar w:top="1440" w:right="1440" w:bottom="1440" w:left="1440" w:header="708" w:footer="708" w:gutter="0"/>
+          <w:cols w:space="708"/>
+          <w:docGrid w:linePitch="360"/>
+        </w:sectPr>
+      </w:pPr>
     </w:p>
     <w:p>
       <w:pPr>
@@ -6460,6 +6494,23 @@
         </w:rPr>
         <w:t xml:space="preserve">}</w:t>
       </w:r>
+    </w:p>
+    <w:p>
+      <w:pPr>
+        <w:jc w:val="both"/>
+        <w:rPr>
+          <w:rFonts w:ascii="Times New Roman" w:hAnsi="Times New Roman" w:cs="Times New Roman"/>
+          <w:sz w:val="32"/>
+          <w:szCs w:val="32"/>
+        </w:rPr>
+        <w:sectPr>
+          <w:type w:val="continuous"/>
+          <w:pgSz w:w="11906" w:h="16838"/>
+          <w:pgMar w:top="1440" w:right="1440" w:bottom="1440" w:left="1440" w:header="708" w:footer="708" w:gutter="0"/>
+          <w:cols w:num="2" w:space="708"/>
+          <w:docGrid w:linePitch="360"/>
+        </w:sectPr>
+      </w:pPr>
     </w:p>
     <w:p>
       <w:pPr>

</xml_diff>

<commit_message>
fix: style course title as bold red centered 2-line header matching template
</commit_message>
<xml_diff>
--- a/24CS810_T_Sadasivarao_241FA04985_UniCard_Studio.docx
+++ b/24CS810_T_Sadasivarao_241FA04985_UniCard_Studio.docx
@@ -69,97 +69,91 @@
     </w:p>
     <w:p>
       <w:pPr>
-        <w:jc w:val="both"/>
-        <w:rPr>
-          <w:rFonts w:ascii="Times New Roman" w:hAnsi="Times New Roman" w:cs="Times New Roman"/>
-          <w:sz w:val="32"/>
-          <w:szCs w:val="32"/>
-        </w:rPr>
-      </w:pPr>
-    </w:p>
-    <w:p>
-      <w:pPr>
-        <w:jc w:val="both"/>
-        <w:rPr>
-          <w:rFonts w:ascii="Times New Roman" w:hAnsi="Times New Roman" w:cs="Times New Roman"/>
-          <w:color w:val="000000" w:themeColor="text1"/>
-          <w:sz w:val="32"/>
-          <w:szCs w:val="32"/>
-        </w:rPr>
-      </w:pPr>
-      <w:r>
-        <w:rPr>
-          <w:rFonts w:ascii="Times New Roman" w:hAnsi="Times New Roman" w:cs="Times New Roman"/>
-          <w:color w:val="000000" w:themeColor="text1"/>
-          <w:sz w:val="32"/>
-          <w:szCs w:val="32"/>
-        </w:rPr>
-        <w:t xml:space="preserve">24CS810-Modern Front-End Frameworks and SPA Development</w:t>
-      </w:r>
-    </w:p>
-    <w:p>
-      <w:pPr>
-        <w:jc w:val="both"/>
-        <w:rPr>
-          <w:rFonts w:ascii="Times New Roman" w:hAnsi="Times New Roman" w:cs="Times New Roman"/>
-          <w:sz w:val="32"/>
-          <w:szCs w:val="32"/>
-        </w:rPr>
-      </w:pPr>
-    </w:p>
-    <w:p>
-      <w:pPr>
-        <w:jc w:val="both"/>
-        <w:rPr>
-          <w:rFonts w:ascii="Times New Roman" w:hAnsi="Times New Roman" w:cs="Times New Roman"/>
-          <w:sz w:val="32"/>
-          <w:szCs w:val="32"/>
-        </w:rPr>
-      </w:pPr>
-    </w:p>
-    <w:p>
-      <w:pPr>
-        <w:jc w:val="both"/>
-        <w:rPr>
-          <w:rFonts w:ascii="Times New Roman" w:hAnsi="Times New Roman" w:cs="Times New Roman"/>
-          <w:sz w:val="32"/>
-          <w:szCs w:val="32"/>
-        </w:rPr>
-      </w:pPr>
-    </w:p>
-    <w:p>
-      <w:pPr>
-        <w:jc w:val="both"/>
-        <w:rPr>
-          <w:rFonts w:ascii="Times New Roman" w:hAnsi="Times New Roman" w:cs="Times New Roman"/>
-          <w:color w:val="000000" w:themeColor="text1"/>
-          <w:sz w:val="32"/>
-          <w:szCs w:val="32"/>
-        </w:rPr>
-      </w:pPr>
-      <w:r>
-        <w:rPr>
-          <w:rFonts w:ascii="Times New Roman" w:hAnsi="Times New Roman" w:cs="Times New Roman"/>
-          <w:color w:val="000000" w:themeColor="text1"/>
-          <w:sz w:val="32"/>
-          <w:szCs w:val="32"/>
-        </w:rPr>
-        <w:t xml:space="preserve">NAME OF STUDENT: T. Sadasivarao</w:t>
-      </w:r>
-    </w:p>
-    <w:p>
-      <w:pPr>
-        <w:jc w:val="both"/>
-        <w:rPr>
-          <w:rFonts w:ascii="Times New Roman" w:hAnsi="Times New Roman" w:cs="Times New Roman"/>
-          <w:color w:val="000000" w:themeColor="text1"/>
-          <w:sz w:val="32"/>
-          <w:szCs w:val="32"/>
-        </w:rPr>
-      </w:pPr>
-      <w:r>
-        <w:rPr>
-          <w:rFonts w:ascii="Times New Roman" w:hAnsi="Times New Roman" w:cs="Times New Roman"/>
+        <w:jc w:val="center"/>
+        <w:rPr>
+          <w:rFonts w:ascii="Times New Roman" w:hAnsi="Times New Roman" w:cs="Times New Roman"/>
+          <w:b/>
+          <w:bCs/>
+          <w:color w:val="EE0000"/>
+          <w:sz w:val="44"/>
+          <w:szCs w:val="44"/>
+        </w:rPr>
+      </w:pPr>
+      <w:r>
+        <w:rPr>
+          <w:rFonts w:ascii="Times New Roman" w:hAnsi="Times New Roman" w:cs="Times New Roman"/>
+          <w:b/>
+          <w:bCs/>
+          <w:color w:val="EE0000"/>
+          <w:sz w:val="44"/>
+          <w:szCs w:val="44"/>
+        </w:rPr>
+        <w:t>24CS810-Modern Front-End Frameworks and</w:t>
+        <w:br/>
+        <w:t>SPA Development</w:t>
+      </w:r>
+    </w:p>
+    <w:p>
+      <w:pPr>
+        <w:jc w:val="both"/>
+        <w:rPr>
+          <w:rFonts w:ascii="Times New Roman" w:hAnsi="Times New Roman" w:cs="Times New Roman"/>
+          <w:sz w:val="32"/>
+          <w:szCs w:val="32"/>
+        </w:rPr>
+      </w:pPr>
+    </w:p>
+    <w:p>
+      <w:pPr>
+        <w:jc w:val="both"/>
+        <w:rPr>
+          <w:rFonts w:ascii="Times New Roman" w:hAnsi="Times New Roman" w:cs="Times New Roman"/>
+          <w:sz w:val="32"/>
+          <w:szCs w:val="32"/>
+        </w:rPr>
+      </w:pPr>
+    </w:p>
+    <w:p>
+      <w:pPr>
+        <w:jc w:val="both"/>
+        <w:rPr>
+          <w:rFonts w:ascii="Times New Roman" w:hAnsi="Times New Roman" w:cs="Times New Roman"/>
+          <w:b/>
+          <w:bCs/>
+          <w:color w:val="000000" w:themeColor="text1"/>
+          <w:sz w:val="32"/>
+          <w:szCs w:val="32"/>
+        </w:rPr>
+      </w:pPr>
+      <w:r>
+        <w:rPr>
+          <w:rFonts w:ascii="Times New Roman" w:hAnsi="Times New Roman" w:cs="Times New Roman"/>
+          <w:b/>
+          <w:bCs/>
+          <w:color w:val="000000" w:themeColor="text1"/>
+          <w:sz w:val="32"/>
+          <w:szCs w:val="32"/>
+        </w:rPr>
+        <w:t xml:space="preserve">NAME OF STUDENT:  T. Sadasivarao</w:t>
+      </w:r>
+    </w:p>
+    <w:p>
+      <w:pPr>
+        <w:jc w:val="both"/>
+        <w:rPr>
+          <w:rFonts w:ascii="Times New Roman" w:hAnsi="Times New Roman" w:cs="Times New Roman"/>
+          <w:b/>
+          <w:bCs/>
+          <w:color w:val="000000" w:themeColor="text1"/>
+          <w:sz w:val="32"/>
+          <w:szCs w:val="32"/>
+        </w:rPr>
+      </w:pPr>
+      <w:r>
+        <w:rPr>
+          <w:rFonts w:ascii="Times New Roman" w:hAnsi="Times New Roman" w:cs="Times New Roman"/>
+          <w:b/>
+          <w:bCs/>
           <w:color w:val="000000" w:themeColor="text1"/>
           <w:sz w:val="32"/>
           <w:szCs w:val="32"/>
@@ -172,14 +166,18 @@
         <w:jc w:val="both"/>
         <w:rPr>
           <w:rFonts w:ascii="Times New Roman" w:hAnsi="Times New Roman" w:cs="Times New Roman"/>
-          <w:color w:val="000000" w:themeColor="text1"/>
-          <w:sz w:val="32"/>
-          <w:szCs w:val="32"/>
-        </w:rPr>
-      </w:pPr>
-      <w:r>
-        <w:rPr>
-          <w:rFonts w:ascii="Times New Roman" w:hAnsi="Times New Roman" w:cs="Times New Roman"/>
+          <w:b/>
+          <w:bCs/>
+          <w:color w:val="000000" w:themeColor="text1"/>
+          <w:sz w:val="32"/>
+          <w:szCs w:val="32"/>
+        </w:rPr>
+      </w:pPr>
+      <w:r>
+        <w:rPr>
+          <w:rFonts w:ascii="Times New Roman" w:hAnsi="Times New Roman" w:cs="Times New Roman"/>
+          <w:b/>
+          <w:bCs/>
           <w:color w:val="000000" w:themeColor="text1"/>
           <w:sz w:val="32"/>
           <w:szCs w:val="32"/>
@@ -192,30 +190,24 @@
         <w:jc w:val="both"/>
         <w:rPr>
           <w:rFonts w:ascii="Times New Roman" w:hAnsi="Times New Roman" w:cs="Times New Roman"/>
-          <w:color w:val="000000" w:themeColor="text1"/>
-          <w:sz w:val="32"/>
-          <w:szCs w:val="32"/>
-        </w:rPr>
-      </w:pPr>
-      <w:r>
-        <w:rPr>
-          <w:rFonts w:ascii="Times New Roman" w:hAnsi="Times New Roman" w:cs="Times New Roman"/>
+          <w:b/>
+          <w:bCs/>
+          <w:color w:val="000000" w:themeColor="text1"/>
+          <w:sz w:val="32"/>
+          <w:szCs w:val="32"/>
+        </w:rPr>
+      </w:pPr>
+      <w:r>
+        <w:rPr>
+          <w:rFonts w:ascii="Times New Roman" w:hAnsi="Times New Roman" w:cs="Times New Roman"/>
+          <w:b/>
+          <w:bCs/>
           <w:color w:val="000000" w:themeColor="text1"/>
           <w:sz w:val="32"/>
           <w:szCs w:val="32"/>
         </w:rPr>
         <w:t xml:space="preserve">PROJECT TITLE: UniCard Studio - Enterprise Smart Credential Generator &amp; Anti-Proxy Transit Platform</w:t>
       </w:r>
-    </w:p>
-    <w:p>
-      <w:pPr>
-        <w:jc w:val="both"/>
-        <w:rPr>
-          <w:rFonts w:ascii="Times New Roman" w:hAnsi="Times New Roman" w:cs="Times New Roman"/>
-          <w:sz w:val="32"/>
-          <w:szCs w:val="32"/>
-        </w:rPr>
-      </w:pPr>
     </w:p>
     <w:p>
       <w:pPr>

</xml_diff>